<commit_message>
ajuste en orden de creditos
</commit_message>
<xml_diff>
--- a/fuentes/CFA2_62110007_DU.docx
+++ b/fuentes/CFA2_62110007_DU.docx
@@ -85,7 +85,7 @@
               </wp:anchor>
             </w:drawing>
           </mc:Choice>
-          <mc:Fallback xmlns:oel="http://schemas.microsoft.com/office/2019/extlst" xmlns:w16du="http://schemas.microsoft.com/office/word/2023/wordml/word16du" xmlns:w16sdtfl="http://schemas.microsoft.com/office/word/2024/wordml/sdtformatlock">
+          <mc:Fallback xmlns:w16sdtfl="http://schemas.microsoft.com/office/word/2024/wordml/sdtformatlock" xmlns:w16du="http://schemas.microsoft.com/office/word/2023/wordml/word16du" xmlns:oel="http://schemas.microsoft.com/office/2019/extlst">
             <w:pict>
               <v:rect w14:anchorId="4E7873B1" id="Rectángulo 3" o:spid="_x0000_s1026" alt="&quot;&quot;" style="position:absolute;margin-left:-54pt;margin-top:31.65pt;width:613.85pt;height:204pt;z-index:-251655168;visibility:visible;mso-wrap-style:square;mso-height-percent:0;mso-wrap-distance-left:9pt;mso-wrap-distance-top:0;mso-wrap-distance-right:9pt;mso-wrap-distance-bottom:0;mso-position-horizontal:absolute;mso-position-horizontal-relative:text;mso-position-vertical:absolute;mso-position-vertical-relative:text;mso-height-percent:0;mso-height-relative:margin;v-text-anchor:middle" o:gfxdata="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" fillcolor="#00314d" stroked="f" strokeweight="1pt"/>
             </w:pict>
@@ -534,7 +534,7 @@
           <w:r>
             <w:fldChar w:fldCharType="separate"/>
           </w:r>
-          <w:hyperlink w:anchor="_Toc213665820" w:history="1">
+          <w:hyperlink w:anchor="_Toc214872432" w:history="1">
             <w:r>
               <w:rPr>
                 <w:rStyle w:val="Hipervnculo"/>
@@ -561,7 +561,7 @@
                 <w:noProof/>
                 <w:webHidden/>
               </w:rPr>
-              <w:instrText xml:space="preserve"> PAGEREF _Toc213665820 \h </w:instrText>
+              <w:instrText xml:space="preserve"> PAGEREF _Toc214872432 \h </w:instrText>
             </w:r>
             <w:r>
               <w:rPr>
@@ -608,7 +608,7 @@
               <w14:ligatures w14:val="none"/>
             </w:rPr>
           </w:pPr>
-          <w:hyperlink w:anchor="_Toc213665821" w:history="1">
+          <w:hyperlink w:anchor="_Toc214872433" w:history="1">
             <w:r>
               <w:rPr>
                 <w:rStyle w:val="Hipervnculo"/>
@@ -653,7 +653,7 @@
                 <w:noProof/>
                 <w:webHidden/>
               </w:rPr>
-              <w:instrText xml:space="preserve"> PAGEREF _Toc213665821 \h </w:instrText>
+              <w:instrText xml:space="preserve"> PAGEREF _Toc214872433 \h </w:instrText>
             </w:r>
             <w:r>
               <w:rPr>
@@ -687,6 +687,10 @@
         <w:p>
           <w:pPr>
             <w:pStyle w:val="TDC2"/>
+            <w:tabs>
+              <w:tab w:val="clear" w:pos="1418"/>
+              <w:tab w:val="left" w:pos="1560"/>
+            </w:tabs>
             <w:rPr>
               <w:rFonts w:eastAsiaTheme="minorEastAsia"/>
               <w:noProof/>
@@ -696,7 +700,7 @@
               <w14:ligatures w14:val="none"/>
             </w:rPr>
           </w:pPr>
-          <w:hyperlink w:anchor="_Toc213665822" w:history="1">
+          <w:hyperlink w:anchor="_Toc214872434" w:history="1">
             <w:r>
               <w:rPr>
                 <w:rStyle w:val="Hipervnculo"/>
@@ -741,7 +745,7 @@
                 <w:noProof/>
                 <w:webHidden/>
               </w:rPr>
-              <w:instrText xml:space="preserve"> PAGEREF _Toc213665822 \h </w:instrText>
+              <w:instrText xml:space="preserve"> PAGEREF _Toc214872434 \h </w:instrText>
             </w:r>
             <w:r>
               <w:rPr>
@@ -775,6 +779,10 @@
         <w:p>
           <w:pPr>
             <w:pStyle w:val="TDC2"/>
+            <w:tabs>
+              <w:tab w:val="clear" w:pos="1418"/>
+              <w:tab w:val="left" w:pos="1560"/>
+            </w:tabs>
             <w:rPr>
               <w:rFonts w:eastAsiaTheme="minorEastAsia"/>
               <w:noProof/>
@@ -784,7 +792,7 @@
               <w14:ligatures w14:val="none"/>
             </w:rPr>
           </w:pPr>
-          <w:hyperlink w:anchor="_Toc213665823" w:history="1">
+          <w:hyperlink w:anchor="_Toc214872435" w:history="1">
             <w:r>
               <w:rPr>
                 <w:rStyle w:val="Hipervnculo"/>
@@ -829,7 +837,7 @@
                 <w:noProof/>
                 <w:webHidden/>
               </w:rPr>
-              <w:instrText xml:space="preserve"> PAGEREF _Toc213665823 \h </w:instrText>
+              <w:instrText xml:space="preserve"> PAGEREF _Toc214872435 \h </w:instrText>
             </w:r>
             <w:r>
               <w:rPr>
@@ -863,6 +871,10 @@
         <w:p>
           <w:pPr>
             <w:pStyle w:val="TDC2"/>
+            <w:tabs>
+              <w:tab w:val="clear" w:pos="1418"/>
+              <w:tab w:val="left" w:pos="1560"/>
+            </w:tabs>
             <w:rPr>
               <w:rFonts w:eastAsiaTheme="minorEastAsia"/>
               <w:noProof/>
@@ -872,7 +884,7 @@
               <w14:ligatures w14:val="none"/>
             </w:rPr>
           </w:pPr>
-          <w:hyperlink w:anchor="_Toc213665824" w:history="1">
+          <w:hyperlink w:anchor="_Toc214872436" w:history="1">
             <w:r>
               <w:rPr>
                 <w:rStyle w:val="Hipervnculo"/>
@@ -917,7 +929,7 @@
                 <w:noProof/>
                 <w:webHidden/>
               </w:rPr>
-              <w:instrText xml:space="preserve"> PAGEREF _Toc213665824 \h </w:instrText>
+              <w:instrText xml:space="preserve"> PAGEREF _Toc214872436 \h </w:instrText>
             </w:r>
             <w:r>
               <w:rPr>
@@ -951,6 +963,10 @@
         <w:p>
           <w:pPr>
             <w:pStyle w:val="TDC2"/>
+            <w:tabs>
+              <w:tab w:val="clear" w:pos="1418"/>
+              <w:tab w:val="left" w:pos="1560"/>
+            </w:tabs>
             <w:rPr>
               <w:rFonts w:eastAsiaTheme="minorEastAsia"/>
               <w:noProof/>
@@ -960,7 +976,7 @@
               <w14:ligatures w14:val="none"/>
             </w:rPr>
           </w:pPr>
-          <w:hyperlink w:anchor="_Toc213665825" w:history="1">
+          <w:hyperlink w:anchor="_Toc214872437" w:history="1">
             <w:r>
               <w:rPr>
                 <w:rStyle w:val="Hipervnculo"/>
@@ -1005,7 +1021,7 @@
                 <w:noProof/>
                 <w:webHidden/>
               </w:rPr>
-              <w:instrText xml:space="preserve"> PAGEREF _Toc213665825 \h </w:instrText>
+              <w:instrText xml:space="preserve"> PAGEREF _Toc214872437 \h </w:instrText>
             </w:r>
             <w:r>
               <w:rPr>
@@ -1052,7 +1068,7 @@
               <w14:ligatures w14:val="none"/>
             </w:rPr>
           </w:pPr>
-          <w:hyperlink w:anchor="_Toc213665826" w:history="1">
+          <w:hyperlink w:anchor="_Toc214872438" w:history="1">
             <w:r>
               <w:rPr>
                 <w:rStyle w:val="Hipervnculo"/>
@@ -1097,7 +1113,7 @@
                 <w:noProof/>
                 <w:webHidden/>
               </w:rPr>
-              <w:instrText xml:space="preserve"> PAGEREF _Toc213665826 \h </w:instrText>
+              <w:instrText xml:space="preserve"> PAGEREF _Toc214872438 \h </w:instrText>
             </w:r>
             <w:r>
               <w:rPr>
@@ -1131,6 +1147,10 @@
         <w:p>
           <w:pPr>
             <w:pStyle w:val="TDC2"/>
+            <w:tabs>
+              <w:tab w:val="clear" w:pos="1418"/>
+              <w:tab w:val="left" w:pos="1560"/>
+            </w:tabs>
             <w:rPr>
               <w:rFonts w:eastAsiaTheme="minorEastAsia"/>
               <w:noProof/>
@@ -1140,7 +1160,7 @@
               <w14:ligatures w14:val="none"/>
             </w:rPr>
           </w:pPr>
-          <w:hyperlink w:anchor="_Toc213665828" w:history="1">
+          <w:hyperlink w:anchor="_Toc214872440" w:history="1">
             <w:r>
               <w:rPr>
                 <w:rStyle w:val="Hipervnculo"/>
@@ -1185,7 +1205,7 @@
                 <w:noProof/>
                 <w:webHidden/>
               </w:rPr>
-              <w:instrText xml:space="preserve"> PAGEREF _Toc213665828 \h </w:instrText>
+              <w:instrText xml:space="preserve"> PAGEREF _Toc214872440 \h </w:instrText>
             </w:r>
             <w:r>
               <w:rPr>
@@ -1219,6 +1239,10 @@
         <w:p>
           <w:pPr>
             <w:pStyle w:val="TDC2"/>
+            <w:tabs>
+              <w:tab w:val="clear" w:pos="1418"/>
+              <w:tab w:val="left" w:pos="1560"/>
+            </w:tabs>
             <w:rPr>
               <w:rFonts w:eastAsiaTheme="minorEastAsia"/>
               <w:noProof/>
@@ -1228,7 +1252,7 @@
               <w14:ligatures w14:val="none"/>
             </w:rPr>
           </w:pPr>
-          <w:hyperlink w:anchor="_Toc213665829" w:history="1">
+          <w:hyperlink w:anchor="_Toc214872441" w:history="1">
             <w:r>
               <w:rPr>
                 <w:rStyle w:val="Hipervnculo"/>
@@ -1273,7 +1297,7 @@
                 <w:noProof/>
                 <w:webHidden/>
               </w:rPr>
-              <w:instrText xml:space="preserve"> PAGEREF _Toc213665829 \h </w:instrText>
+              <w:instrText xml:space="preserve"> PAGEREF _Toc214872441 \h </w:instrText>
             </w:r>
             <w:r>
               <w:rPr>
@@ -1307,6 +1331,10 @@
         <w:p>
           <w:pPr>
             <w:pStyle w:val="TDC2"/>
+            <w:tabs>
+              <w:tab w:val="clear" w:pos="1418"/>
+              <w:tab w:val="left" w:pos="1560"/>
+            </w:tabs>
             <w:rPr>
               <w:rFonts w:eastAsiaTheme="minorEastAsia"/>
               <w:noProof/>
@@ -1316,7 +1344,7 @@
               <w14:ligatures w14:val="none"/>
             </w:rPr>
           </w:pPr>
-          <w:hyperlink w:anchor="_Toc213665830" w:history="1">
+          <w:hyperlink w:anchor="_Toc214872442" w:history="1">
             <w:r>
               <w:rPr>
                 <w:rStyle w:val="Hipervnculo"/>
@@ -1361,7 +1389,7 @@
                 <w:noProof/>
                 <w:webHidden/>
               </w:rPr>
-              <w:instrText xml:space="preserve"> PAGEREF _Toc213665830 \h </w:instrText>
+              <w:instrText xml:space="preserve"> PAGEREF _Toc214872442 \h </w:instrText>
             </w:r>
             <w:r>
               <w:rPr>
@@ -1408,7 +1436,7 @@
               <w14:ligatures w14:val="none"/>
             </w:rPr>
           </w:pPr>
-          <w:hyperlink w:anchor="_Toc213665831" w:history="1">
+          <w:hyperlink w:anchor="_Toc214872443" w:history="1">
             <w:r>
               <w:rPr>
                 <w:rStyle w:val="Hipervnculo"/>
@@ -1453,7 +1481,7 @@
                 <w:noProof/>
                 <w:webHidden/>
               </w:rPr>
-              <w:instrText xml:space="preserve"> PAGEREF _Toc213665831 \h </w:instrText>
+              <w:instrText xml:space="preserve"> PAGEREF _Toc214872443 \h </w:instrText>
             </w:r>
             <w:r>
               <w:rPr>
@@ -1487,6 +1515,10 @@
         <w:p>
           <w:pPr>
             <w:pStyle w:val="TDC2"/>
+            <w:tabs>
+              <w:tab w:val="clear" w:pos="1418"/>
+              <w:tab w:val="left" w:pos="1560"/>
+            </w:tabs>
             <w:rPr>
               <w:rFonts w:eastAsiaTheme="minorEastAsia"/>
               <w:noProof/>
@@ -1496,7 +1528,7 @@
               <w14:ligatures w14:val="none"/>
             </w:rPr>
           </w:pPr>
-          <w:hyperlink w:anchor="_Toc213665833" w:history="1">
+          <w:hyperlink w:anchor="_Toc214872445" w:history="1">
             <w:r>
               <w:rPr>
                 <w:rStyle w:val="Hipervnculo"/>
@@ -1541,7 +1573,7 @@
                 <w:noProof/>
                 <w:webHidden/>
               </w:rPr>
-              <w:instrText xml:space="preserve"> PAGEREF _Toc213665833 \h </w:instrText>
+              <w:instrText xml:space="preserve"> PAGEREF _Toc214872445 \h </w:instrText>
             </w:r>
             <w:r>
               <w:rPr>
@@ -1575,6 +1607,10 @@
         <w:p>
           <w:pPr>
             <w:pStyle w:val="TDC2"/>
+            <w:tabs>
+              <w:tab w:val="clear" w:pos="1418"/>
+              <w:tab w:val="left" w:pos="1560"/>
+            </w:tabs>
             <w:rPr>
               <w:rFonts w:eastAsiaTheme="minorEastAsia"/>
               <w:noProof/>
@@ -1584,7 +1620,7 @@
               <w14:ligatures w14:val="none"/>
             </w:rPr>
           </w:pPr>
-          <w:hyperlink w:anchor="_Toc213665834" w:history="1">
+          <w:hyperlink w:anchor="_Toc214872446" w:history="1">
             <w:r>
               <w:rPr>
                 <w:rStyle w:val="Hipervnculo"/>
@@ -1629,7 +1665,7 @@
                 <w:noProof/>
                 <w:webHidden/>
               </w:rPr>
-              <w:instrText xml:space="preserve"> PAGEREF _Toc213665834 \h </w:instrText>
+              <w:instrText xml:space="preserve"> PAGEREF _Toc214872446 \h </w:instrText>
             </w:r>
             <w:r>
               <w:rPr>
@@ -1663,6 +1699,10 @@
         <w:p>
           <w:pPr>
             <w:pStyle w:val="TDC2"/>
+            <w:tabs>
+              <w:tab w:val="clear" w:pos="1418"/>
+              <w:tab w:val="left" w:pos="1560"/>
+            </w:tabs>
             <w:rPr>
               <w:rFonts w:eastAsiaTheme="minorEastAsia"/>
               <w:noProof/>
@@ -1672,7 +1712,7 @@
               <w14:ligatures w14:val="none"/>
             </w:rPr>
           </w:pPr>
-          <w:hyperlink w:anchor="_Toc213665835" w:history="1">
+          <w:hyperlink w:anchor="_Toc214872447" w:history="1">
             <w:r>
               <w:rPr>
                 <w:rStyle w:val="Hipervnculo"/>
@@ -1717,7 +1757,7 @@
                 <w:noProof/>
                 <w:webHidden/>
               </w:rPr>
-              <w:instrText xml:space="preserve"> PAGEREF _Toc213665835 \h </w:instrText>
+              <w:instrText xml:space="preserve"> PAGEREF _Toc214872447 \h </w:instrText>
             </w:r>
             <w:r>
               <w:rPr>
@@ -1751,6 +1791,10 @@
         <w:p>
           <w:pPr>
             <w:pStyle w:val="TDC2"/>
+            <w:tabs>
+              <w:tab w:val="clear" w:pos="1418"/>
+              <w:tab w:val="left" w:pos="1560"/>
+            </w:tabs>
             <w:rPr>
               <w:rFonts w:eastAsiaTheme="minorEastAsia"/>
               <w:noProof/>
@@ -1760,7 +1804,7 @@
               <w14:ligatures w14:val="none"/>
             </w:rPr>
           </w:pPr>
-          <w:hyperlink w:anchor="_Toc213665836" w:history="1">
+          <w:hyperlink w:anchor="_Toc214872448" w:history="1">
             <w:r>
               <w:rPr>
                 <w:rStyle w:val="Hipervnculo"/>
@@ -1805,7 +1849,7 @@
                 <w:noProof/>
                 <w:webHidden/>
               </w:rPr>
-              <w:instrText xml:space="preserve"> PAGEREF _Toc213665836 \h </w:instrText>
+              <w:instrText xml:space="preserve"> PAGEREF _Toc214872448 \h </w:instrText>
             </w:r>
             <w:r>
               <w:rPr>
@@ -1839,6 +1883,10 @@
         <w:p>
           <w:pPr>
             <w:pStyle w:val="TDC2"/>
+            <w:tabs>
+              <w:tab w:val="clear" w:pos="1418"/>
+              <w:tab w:val="left" w:pos="1560"/>
+            </w:tabs>
             <w:rPr>
               <w:rFonts w:eastAsiaTheme="minorEastAsia"/>
               <w:noProof/>
@@ -1848,7 +1896,7 @@
               <w14:ligatures w14:val="none"/>
             </w:rPr>
           </w:pPr>
-          <w:hyperlink w:anchor="_Toc213665837" w:history="1">
+          <w:hyperlink w:anchor="_Toc214872449" w:history="1">
             <w:r>
               <w:rPr>
                 <w:rStyle w:val="Hipervnculo"/>
@@ -1893,7 +1941,7 @@
                 <w:noProof/>
                 <w:webHidden/>
               </w:rPr>
-              <w:instrText xml:space="preserve"> PAGEREF _Toc213665837 \h </w:instrText>
+              <w:instrText xml:space="preserve"> PAGEREF _Toc214872449 \h </w:instrText>
             </w:r>
             <w:r>
               <w:rPr>
@@ -1939,7 +1987,7 @@
               <w14:ligatures w14:val="none"/>
             </w:rPr>
           </w:pPr>
-          <w:hyperlink w:anchor="_Toc213665838" w:history="1">
+          <w:hyperlink w:anchor="_Toc214872450" w:history="1">
             <w:r>
               <w:rPr>
                 <w:rStyle w:val="Hipervnculo"/>
@@ -1966,7 +2014,7 @@
                 <w:noProof/>
                 <w:webHidden/>
               </w:rPr>
-              <w:instrText xml:space="preserve"> PAGEREF _Toc213665838 \h </w:instrText>
+              <w:instrText xml:space="preserve"> PAGEREF _Toc214872450 \h </w:instrText>
             </w:r>
             <w:r>
               <w:rPr>
@@ -2012,7 +2060,7 @@
               <w14:ligatures w14:val="none"/>
             </w:rPr>
           </w:pPr>
-          <w:hyperlink w:anchor="_Toc213665839" w:history="1">
+          <w:hyperlink w:anchor="_Toc214872451" w:history="1">
             <w:r>
               <w:rPr>
                 <w:rStyle w:val="Hipervnculo"/>
@@ -2039,7 +2087,7 @@
                 <w:noProof/>
                 <w:webHidden/>
               </w:rPr>
-              <w:instrText xml:space="preserve"> PAGEREF _Toc213665839 \h </w:instrText>
+              <w:instrText xml:space="preserve"> PAGEREF _Toc214872451 \h </w:instrText>
             </w:r>
             <w:r>
               <w:rPr>
@@ -2085,7 +2133,7 @@
               <w14:ligatures w14:val="none"/>
             </w:rPr>
           </w:pPr>
-          <w:hyperlink w:anchor="_Toc213665840" w:history="1">
+          <w:hyperlink w:anchor="_Toc214872452" w:history="1">
             <w:r>
               <w:rPr>
                 <w:rStyle w:val="Hipervnculo"/>
@@ -2112,7 +2160,7 @@
                 <w:noProof/>
                 <w:webHidden/>
               </w:rPr>
-              <w:instrText xml:space="preserve"> PAGEREF _Toc213665840 \h </w:instrText>
+              <w:instrText xml:space="preserve"> PAGEREF _Toc214872452 \h </w:instrText>
             </w:r>
             <w:r>
               <w:rPr>
@@ -2158,7 +2206,7 @@
               <w14:ligatures w14:val="none"/>
             </w:rPr>
           </w:pPr>
-          <w:hyperlink w:anchor="_Toc213665841" w:history="1">
+          <w:hyperlink w:anchor="_Toc214872453" w:history="1">
             <w:r>
               <w:rPr>
                 <w:rStyle w:val="Hipervnculo"/>
@@ -2185,7 +2233,7 @@
                 <w:noProof/>
                 <w:webHidden/>
               </w:rPr>
-              <w:instrText xml:space="preserve"> PAGEREF _Toc213665841 \h </w:instrText>
+              <w:instrText xml:space="preserve"> PAGEREF _Toc214872453 \h </w:instrText>
             </w:r>
             <w:r>
               <w:rPr>
@@ -2231,7 +2279,7 @@
               <w14:ligatures w14:val="none"/>
             </w:rPr>
           </w:pPr>
-          <w:hyperlink w:anchor="_Toc213665842" w:history="1">
+          <w:hyperlink w:anchor="_Toc214872454" w:history="1">
             <w:r>
               <w:rPr>
                 <w:rStyle w:val="Hipervnculo"/>
@@ -2258,7 +2306,7 @@
                 <w:noProof/>
                 <w:webHidden/>
               </w:rPr>
-              <w:instrText xml:space="preserve"> PAGEREF _Toc213665842 \h </w:instrText>
+              <w:instrText xml:space="preserve"> PAGEREF _Toc214872454 \h </w:instrText>
             </w:r>
             <w:r>
               <w:rPr>
@@ -2323,7 +2371,7 @@
       <w:pPr>
         <w:pStyle w:val="Titulosgenerales"/>
       </w:pPr>
-      <w:bookmarkStart w:id="0" w:name="_Toc213665820"/>
+      <w:bookmarkStart w:id="0" w:name="_Toc214872432"/>
       <w:r>
         <w:lastRenderedPageBreak/>
         <w:t>Introducción</w:t>
@@ -2681,7 +2729,7 @@
       <w:pPr>
         <w:pStyle w:val="Ttulo1"/>
       </w:pPr>
-      <w:bookmarkStart w:id="1" w:name="_Toc213665821"/>
+      <w:bookmarkStart w:id="1" w:name="_Toc214872433"/>
       <w:r>
         <w:lastRenderedPageBreak/>
         <w:t>Objetivos de la cadena de suministro</w:t>
@@ -2717,7 +2765,10 @@
       <w:pPr>
         <w:pStyle w:val="Ttulo2"/>
       </w:pPr>
-      <w:bookmarkStart w:id="2" w:name="_Toc213665822"/>
+      <w:r>
+        <w:t xml:space="preserve"> </w:t>
+      </w:r>
+      <w:bookmarkStart w:id="2" w:name="_Toc214872434"/>
       <w:r>
         <w:t>Concepto</w:t>
       </w:r>
@@ -2913,7 +2964,7 @@
       <w:pPr>
         <w:pStyle w:val="Ttulo2"/>
       </w:pPr>
-      <w:bookmarkStart w:id="3" w:name="_Toc213665823"/>
+      <w:bookmarkStart w:id="3" w:name="_Toc214872435"/>
       <w:r>
         <w:t>Tipos</w:t>
       </w:r>
@@ -3123,7 +3174,7 @@
       <w:pPr>
         <w:pStyle w:val="Ttulo2"/>
       </w:pPr>
-      <w:bookmarkStart w:id="4" w:name="_Toc213665824"/>
+      <w:bookmarkStart w:id="4" w:name="_Toc214872436"/>
       <w:r>
         <w:lastRenderedPageBreak/>
         <w:t>Metodología de diseño</w:t>
@@ -3321,7 +3372,7 @@
       <w:pPr>
         <w:pStyle w:val="Ttulo2"/>
       </w:pPr>
-      <w:bookmarkStart w:id="5" w:name="_Toc213665825"/>
+      <w:bookmarkStart w:id="5" w:name="_Toc214872437"/>
       <w:r>
         <w:lastRenderedPageBreak/>
         <w:t>Aplicabilidad</w:t>
@@ -3338,7 +3389,21 @@
         <w:rPr>
           <w:lang w:val="es-419" w:eastAsia="es-CO"/>
         </w:rPr>
-        <w:t>Los objetivos sostenibles en la cadena de suministro se pueden implementar en todo tipo de organizaciones, sin importar su tamaño o sector económico. Esto se debe a que los impactos ambientales, sociales y económicos se presentan en todos los eslabones productivos y comerciales, y abordarlos estratégicamente genera valor compartido, fortalece la competitividad y optimiza la gestión de riesgos (Seuring &amp; Müller, 2008).</w:t>
+        <w:t>Los objetivos sostenibles en la cadena de suministro se pueden implementar en todo tipo de organizaciones, sin importar su tamaño o sector económico. Esto se debe a que los impactos ambientales, sociales y económicos se presentan en todos los eslabones productivos y comerciales, y abordarlos estratégicamente genera valor compartido, fortalece la competitividad y optimiza la gestión de riesgos (</w:t>
+      </w:r>
+      <w:proofErr w:type="spellStart"/>
+      <w:r>
+        <w:rPr>
+          <w:lang w:val="es-419" w:eastAsia="es-CO"/>
+        </w:rPr>
+        <w:t>Seuring</w:t>
+      </w:r>
+      <w:proofErr w:type="spellEnd"/>
+      <w:r>
+        <w:rPr>
+          <w:lang w:val="es-419" w:eastAsia="es-CO"/>
+        </w:rPr>
+        <w:t xml:space="preserve"> &amp; Müller, 2008).</w:t>
       </w:r>
     </w:p>
     <w:p>
@@ -3530,7 +3595,7 @@
       <w:pPr>
         <w:pStyle w:val="Ttulo1"/>
       </w:pPr>
-      <w:bookmarkStart w:id="6" w:name="_Toc213665826"/>
+      <w:bookmarkStart w:id="6" w:name="_Toc214872438"/>
       <w:r>
         <w:lastRenderedPageBreak/>
         <w:t>Estrategias sostenibles</w:t>
@@ -3601,6 +3666,7 @@
       <w:bookmarkStart w:id="13" w:name="_Toc213403285"/>
       <w:bookmarkStart w:id="14" w:name="_Toc213403308"/>
       <w:bookmarkStart w:id="15" w:name="_Toc213665827"/>
+      <w:bookmarkStart w:id="16" w:name="_Toc214872439"/>
       <w:bookmarkEnd w:id="7"/>
       <w:bookmarkEnd w:id="8"/>
       <w:bookmarkEnd w:id="9"/>
@@ -3610,16 +3676,17 @@
       <w:bookmarkEnd w:id="13"/>
       <w:bookmarkEnd w:id="14"/>
       <w:bookmarkEnd w:id="15"/>
+      <w:bookmarkEnd w:id="16"/>
     </w:p>
     <w:p>
       <w:pPr>
         <w:pStyle w:val="Ttulo2"/>
       </w:pPr>
-      <w:bookmarkStart w:id="16" w:name="_Toc213665828"/>
+      <w:bookmarkStart w:id="17" w:name="_Toc214872440"/>
       <w:r>
         <w:t>Concepto</w:t>
       </w:r>
-      <w:bookmarkEnd w:id="16"/>
+      <w:bookmarkEnd w:id="17"/>
     </w:p>
     <w:p>
       <w:pPr>
@@ -3644,11 +3711,11 @@
       <w:pPr>
         <w:pStyle w:val="Ttulo2"/>
       </w:pPr>
-      <w:bookmarkStart w:id="17" w:name="_Toc213665829"/>
+      <w:bookmarkStart w:id="18" w:name="_Toc214872441"/>
       <w:r>
         <w:t>Tipos</w:t>
       </w:r>
-      <w:bookmarkEnd w:id="17"/>
+      <w:bookmarkEnd w:id="18"/>
     </w:p>
     <w:p>
       <w:pPr>
@@ -3879,12 +3946,12 @@
       <w:pPr>
         <w:pStyle w:val="Ttulo2"/>
       </w:pPr>
-      <w:bookmarkStart w:id="18" w:name="_Toc213665830"/>
+      <w:bookmarkStart w:id="19" w:name="_Toc214872442"/>
       <w:r>
         <w:lastRenderedPageBreak/>
         <w:t>Metodología de diseño</w:t>
       </w:r>
-      <w:bookmarkEnd w:id="18"/>
+      <w:bookmarkEnd w:id="19"/>
     </w:p>
     <w:p>
       <w:pPr>
@@ -4031,7 +4098,21 @@
         <w:rPr>
           <w:lang w:val="es-419" w:eastAsia="es-CO"/>
         </w:rPr>
-        <w:t>e monitorean los resultados mediante indicadores clave de desempeño (KPIs), ajustando el plan para mantener la eficacia y promover la innovación constante.</w:t>
+        <w:t>e monitorean los resultados mediante indicadores clave de desempeño (</w:t>
+      </w:r>
+      <w:proofErr w:type="spellStart"/>
+      <w:r>
+        <w:rPr>
+          <w:lang w:val="es-419" w:eastAsia="es-CO"/>
+        </w:rPr>
+        <w:t>KPIs</w:t>
+      </w:r>
+      <w:proofErr w:type="spellEnd"/>
+      <w:r>
+        <w:rPr>
+          <w:lang w:val="es-419" w:eastAsia="es-CO"/>
+        </w:rPr>
+        <w:t>), ajustando el plan para mantener la eficacia y promover la innovación constante.</w:t>
       </w:r>
     </w:p>
     <w:p>
@@ -4059,12 +4140,12 @@
       <w:pPr>
         <w:pStyle w:val="Ttulo1"/>
       </w:pPr>
-      <w:bookmarkStart w:id="19" w:name="_Toc213665831"/>
+      <w:bookmarkStart w:id="20" w:name="_Toc214872443"/>
       <w:r>
         <w:lastRenderedPageBreak/>
         <w:t>Plan de integración</w:t>
       </w:r>
-      <w:bookmarkEnd w:id="19"/>
+      <w:bookmarkEnd w:id="20"/>
     </w:p>
     <w:p>
       <w:pPr>
@@ -4103,16 +4184,16 @@
           <w14:ligatures w14:val="none"/>
         </w:rPr>
       </w:pPr>
-      <w:bookmarkStart w:id="20" w:name="_Toc213252547"/>
-      <w:bookmarkStart w:id="21" w:name="_Toc213309667"/>
-      <w:bookmarkStart w:id="22" w:name="_Toc213329327"/>
-      <w:bookmarkStart w:id="23" w:name="_Toc213339129"/>
-      <w:bookmarkStart w:id="24" w:name="_Toc213403110"/>
-      <w:bookmarkStart w:id="25" w:name="_Toc213403133"/>
-      <w:bookmarkStart w:id="26" w:name="_Toc213403290"/>
-      <w:bookmarkStart w:id="27" w:name="_Toc213403313"/>
-      <w:bookmarkStart w:id="28" w:name="_Toc213665832"/>
-      <w:bookmarkEnd w:id="20"/>
+      <w:bookmarkStart w:id="21" w:name="_Toc213252547"/>
+      <w:bookmarkStart w:id="22" w:name="_Toc213309667"/>
+      <w:bookmarkStart w:id="23" w:name="_Toc213329327"/>
+      <w:bookmarkStart w:id="24" w:name="_Toc213339129"/>
+      <w:bookmarkStart w:id="25" w:name="_Toc213403110"/>
+      <w:bookmarkStart w:id="26" w:name="_Toc213403133"/>
+      <w:bookmarkStart w:id="27" w:name="_Toc213403290"/>
+      <w:bookmarkStart w:id="28" w:name="_Toc213403313"/>
+      <w:bookmarkStart w:id="29" w:name="_Toc213665832"/>
+      <w:bookmarkStart w:id="30" w:name="_Toc214872444"/>
       <w:bookmarkEnd w:id="21"/>
       <w:bookmarkEnd w:id="22"/>
       <w:bookmarkEnd w:id="23"/>
@@ -4121,16 +4202,18 @@
       <w:bookmarkEnd w:id="26"/>
       <w:bookmarkEnd w:id="27"/>
       <w:bookmarkEnd w:id="28"/>
+      <w:bookmarkEnd w:id="29"/>
+      <w:bookmarkEnd w:id="30"/>
     </w:p>
     <w:p>
       <w:pPr>
         <w:pStyle w:val="Ttulo2"/>
       </w:pPr>
-      <w:bookmarkStart w:id="29" w:name="_Toc213665833"/>
+      <w:bookmarkStart w:id="31" w:name="_Toc214872445"/>
       <w:r>
         <w:t>Concepto</w:t>
       </w:r>
-      <w:bookmarkEnd w:id="29"/>
+      <w:bookmarkEnd w:id="31"/>
       <w:r>
         <w:t xml:space="preserve"> </w:t>
       </w:r>
@@ -4152,11 +4235,11 @@
       <w:pPr>
         <w:pStyle w:val="Ttulo2"/>
       </w:pPr>
-      <w:bookmarkStart w:id="30" w:name="_Toc213665834"/>
+      <w:bookmarkStart w:id="32" w:name="_Toc214872446"/>
       <w:r>
         <w:t>Estructura</w:t>
       </w:r>
-      <w:bookmarkEnd w:id="30"/>
+      <w:bookmarkEnd w:id="32"/>
     </w:p>
     <w:p>
       <w:pPr>
@@ -4292,90 +4375,108 @@
           <w:bCs/>
           <w:lang w:val="es-419" w:eastAsia="es-CO"/>
         </w:rPr>
-        <w:t>Indicadores (KPIs):</w:t>
-      </w:r>
-      <w:r>
-        <w:rPr>
-          <w:lang w:val="es-419" w:eastAsia="es-CO"/>
-        </w:rPr>
-        <w:t xml:space="preserve"> e</w:t>
-      </w:r>
-      <w:r>
-        <w:rPr>
-          <w:lang w:val="es-419" w:eastAsia="es-CO"/>
-        </w:rPr>
-        <w:t>stablecen las métricas que miden el avance y desempeño del plan en los ámbitos ambiental, social y económico, reflejando mejoras en eficiencia o reducción de emisiones.</w:t>
-      </w:r>
-    </w:p>
-    <w:p>
-      <w:pPr>
-        <w:rPr>
-          <w:lang w:val="es-419" w:eastAsia="es-CO"/>
-        </w:rPr>
-      </w:pPr>
+        <w:t>Indicadores (</w:t>
+      </w:r>
+      <w:proofErr w:type="spellStart"/>
       <w:r>
         <w:rPr>
           <w:b/>
           <w:bCs/>
           <w:lang w:val="es-419" w:eastAsia="es-CO"/>
         </w:rPr>
-        <w:t>Presupuesto:</w:t>
-      </w:r>
-      <w:r>
-        <w:rPr>
-          <w:lang w:val="es-419" w:eastAsia="es-CO"/>
-        </w:rPr>
-        <w:t xml:space="preserve"> d</w:t>
-      </w:r>
-      <w:r>
-        <w:rPr>
-          <w:lang w:val="es-419" w:eastAsia="es-CO"/>
-        </w:rPr>
-        <w:t>etermina los costos asociados a cada actividad y las fuentes de financiación posibles, incluyendo recursos internos, créditos verdes o alianzas de cooperación para el desarrollo sostenible.</w:t>
-      </w:r>
-    </w:p>
-    <w:p>
-      <w:pPr>
-        <w:pStyle w:val="Ttulo2"/>
-      </w:pPr>
-      <w:bookmarkStart w:id="31" w:name="_Toc213665835"/>
-      <w:r>
-        <w:t>Recursos</w:t>
-      </w:r>
-      <w:bookmarkEnd w:id="31"/>
-    </w:p>
-    <w:p>
-      <w:pPr>
-        <w:rPr>
-          <w:lang w:val="es-419" w:eastAsia="es-CO"/>
-        </w:rPr>
-      </w:pPr>
-      <w:r>
-        <w:rPr>
-          <w:lang w:val="es-419" w:eastAsia="es-CO"/>
-        </w:rPr>
-        <w:t>Para llevar a cabo de manera efectiva un plan de cadena de distribución verde, es indispensable disponer de una combinación estratégica de recursos que garanticen la viabilidad, sostenibilidad y permanencia del proyecto en el tiempo. Estos recursos no solo deben responder a las necesidades operativas, sino también a los retos ambientales, sociales y normativos que implica una transición hacia modelos responsables. A continuación, se detallan los principales tipos de recursos necesarios:</w:t>
-      </w:r>
-    </w:p>
-    <w:p>
-      <w:pPr>
-        <w:rPr>
-          <w:lang w:val="es-419" w:eastAsia="es-CO"/>
-        </w:rPr>
-      </w:pPr>
-    </w:p>
-    <w:p>
-      <w:pPr>
-        <w:rPr>
-          <w:lang w:val="es-419" w:eastAsia="es-CO"/>
-        </w:rPr>
-      </w:pPr>
+        <w:t>KPIs</w:t>
+      </w:r>
+      <w:proofErr w:type="spellEnd"/>
       <w:r>
         <w:rPr>
           <w:b/>
           <w:bCs/>
           <w:lang w:val="es-419" w:eastAsia="es-CO"/>
         </w:rPr>
+        <w:t>):</w:t>
+      </w:r>
+      <w:r>
+        <w:rPr>
+          <w:lang w:val="es-419" w:eastAsia="es-CO"/>
+        </w:rPr>
+        <w:t xml:space="preserve"> e</w:t>
+      </w:r>
+      <w:r>
+        <w:rPr>
+          <w:lang w:val="es-419" w:eastAsia="es-CO"/>
+        </w:rPr>
+        <w:t>stablecen las métricas que miden el avance y desempeño del plan en los ámbitos ambiental, social y económico, reflejando mejoras en eficiencia o reducción de emisiones.</w:t>
+      </w:r>
+    </w:p>
+    <w:p>
+      <w:pPr>
+        <w:rPr>
+          <w:lang w:val="es-419" w:eastAsia="es-CO"/>
+        </w:rPr>
+      </w:pPr>
+      <w:r>
+        <w:rPr>
+          <w:b/>
+          <w:bCs/>
+          <w:lang w:val="es-419" w:eastAsia="es-CO"/>
+        </w:rPr>
+        <w:t>Presupuesto:</w:t>
+      </w:r>
+      <w:r>
+        <w:rPr>
+          <w:lang w:val="es-419" w:eastAsia="es-CO"/>
+        </w:rPr>
+        <w:t xml:space="preserve"> d</w:t>
+      </w:r>
+      <w:r>
+        <w:rPr>
+          <w:lang w:val="es-419" w:eastAsia="es-CO"/>
+        </w:rPr>
+        <w:t>etermina los costos asociados a cada actividad y las fuentes de financiación posibles, incluyendo recursos internos, créditos verdes o alianzas de cooperación para el desarrollo sostenible.</w:t>
+      </w:r>
+    </w:p>
+    <w:p>
+      <w:pPr>
+        <w:pStyle w:val="Ttulo2"/>
+      </w:pPr>
+      <w:bookmarkStart w:id="33" w:name="_Toc214872447"/>
+      <w:r>
+        <w:t>Recursos</w:t>
+      </w:r>
+      <w:bookmarkEnd w:id="33"/>
+    </w:p>
+    <w:p>
+      <w:pPr>
+        <w:rPr>
+          <w:lang w:val="es-419" w:eastAsia="es-CO"/>
+        </w:rPr>
+      </w:pPr>
+      <w:r>
+        <w:rPr>
+          <w:lang w:val="es-419" w:eastAsia="es-CO"/>
+        </w:rPr>
+        <w:t>Para llevar a cabo de manera efectiva un plan de cadena de distribución verde, es indispensable disponer de una combinación estratégica de recursos que garanticen la viabilidad, sostenibilidad y permanencia del proyecto en el tiempo. Estos recursos no solo deben responder a las necesidades operativas, sino también a los retos ambientales, sociales y normativos que implica una transición hacia modelos responsables. A continuación, se detallan los principales tipos de recursos necesarios:</w:t>
+      </w:r>
+    </w:p>
+    <w:p>
+      <w:pPr>
+        <w:rPr>
+          <w:lang w:val="es-419" w:eastAsia="es-CO"/>
+        </w:rPr>
+      </w:pPr>
+    </w:p>
+    <w:p>
+      <w:pPr>
+        <w:rPr>
+          <w:lang w:val="es-419" w:eastAsia="es-CO"/>
+        </w:rPr>
+      </w:pPr>
+      <w:r>
+        <w:rPr>
+          <w:b/>
+          <w:bCs/>
+          <w:lang w:val="es-419" w:eastAsia="es-CO"/>
+        </w:rPr>
         <w:lastRenderedPageBreak/>
         <w:t>Recursos humanos</w:t>
       </w:r>
@@ -4489,11 +4590,11 @@
       <w:pPr>
         <w:pStyle w:val="Ttulo2"/>
       </w:pPr>
-      <w:bookmarkStart w:id="32" w:name="_Toc213665836"/>
+      <w:bookmarkStart w:id="34" w:name="_Toc214872448"/>
       <w:r>
         <w:t>Etapas de elaboración</w:t>
       </w:r>
-      <w:bookmarkEnd w:id="32"/>
+      <w:bookmarkEnd w:id="34"/>
     </w:p>
     <w:p>
       <w:pPr>
@@ -4650,7 +4751,21 @@
         <w:rPr>
           <w:lang w:val="es-419" w:eastAsia="es-CO"/>
         </w:rPr>
-        <w:t>e elabora un cronograma por fases con responsables, indicadores (KPIs) y recursos asignados, estructurando la transición hacia prácticas sostenibles de manera progresiva.</w:t>
+        <w:t>e elabora un cronograma por fases con responsables, indicadores (</w:t>
+      </w:r>
+      <w:proofErr w:type="spellStart"/>
+      <w:r>
+        <w:rPr>
+          <w:lang w:val="es-419" w:eastAsia="es-CO"/>
+        </w:rPr>
+        <w:t>KPIs</w:t>
+      </w:r>
+      <w:proofErr w:type="spellEnd"/>
+      <w:r>
+        <w:rPr>
+          <w:lang w:val="es-419" w:eastAsia="es-CO"/>
+        </w:rPr>
+        <w:t>) y recursos asignados, estructurando la transición hacia prácticas sostenibles de manera progresiva.</w:t>
       </w:r>
     </w:p>
     <w:p>
@@ -4739,11 +4854,11 @@
       <w:pPr>
         <w:pStyle w:val="Ttulo2"/>
       </w:pPr>
-      <w:bookmarkStart w:id="33" w:name="_Toc213665837"/>
+      <w:bookmarkStart w:id="35" w:name="_Toc214872449"/>
       <w:r>
         <w:t>Herramientas</w:t>
       </w:r>
-      <w:bookmarkEnd w:id="33"/>
+      <w:bookmarkEnd w:id="35"/>
     </w:p>
     <w:p>
       <w:pPr>
@@ -5120,7 +5235,7 @@
       <w:pPr>
         <w:pStyle w:val="Titulosgenerales"/>
       </w:pPr>
-      <w:bookmarkStart w:id="34" w:name="_Toc213665838"/>
+      <w:bookmarkStart w:id="36" w:name="_Toc214872450"/>
       <w:r>
         <w:lastRenderedPageBreak/>
         <w:t>S</w:t>
@@ -5128,7 +5243,7 @@
       <w:r>
         <w:t>íntesis</w:t>
       </w:r>
-      <w:bookmarkEnd w:id="34"/>
+      <w:bookmarkEnd w:id="36"/>
       <w:r>
         <w:t xml:space="preserve"> </w:t>
       </w:r>
@@ -5167,6 +5282,7 @@
       </w:pPr>
       <w:r>
         <w:rPr>
+          <w:noProof/>
           <w:lang w:val="es-419" w:eastAsia="es-CO"/>
         </w:rPr>
         <w:drawing>
@@ -5210,12 +5326,12 @@
       <w:pPr>
         <w:pStyle w:val="Titulosgenerales"/>
       </w:pPr>
-      <w:bookmarkStart w:id="35" w:name="_Toc213665839"/>
+      <w:bookmarkStart w:id="37" w:name="_Toc214872451"/>
       <w:r>
         <w:lastRenderedPageBreak/>
         <w:t>Glosario</w:t>
       </w:r>
-      <w:bookmarkEnd w:id="35"/>
+      <w:bookmarkEnd w:id="37"/>
     </w:p>
     <w:p>
       <w:pPr>
@@ -5889,12 +6005,12 @@
       <w:pPr>
         <w:pStyle w:val="Titulosgenerales"/>
       </w:pPr>
-      <w:bookmarkStart w:id="36" w:name="_Toc213665840"/>
+      <w:bookmarkStart w:id="38" w:name="_Toc214872452"/>
       <w:r>
         <w:lastRenderedPageBreak/>
         <w:t>Material complementario</w:t>
       </w:r>
-      <w:bookmarkEnd w:id="36"/>
+      <w:bookmarkEnd w:id="38"/>
     </w:p>
     <w:tbl>
       <w:tblPr>
@@ -6239,12 +6355,12 @@
       <w:pPr>
         <w:pStyle w:val="Titulosgenerales"/>
       </w:pPr>
-      <w:bookmarkStart w:id="37" w:name="_Toc213665841"/>
+      <w:bookmarkStart w:id="39" w:name="_Toc214872453"/>
       <w:r>
         <w:lastRenderedPageBreak/>
         <w:t>Referencias bibliográficas</w:t>
       </w:r>
-      <w:bookmarkEnd w:id="37"/>
+      <w:bookmarkEnd w:id="39"/>
       <w:r>
         <w:t xml:space="preserve"> </w:t>
       </w:r>
@@ -6440,7 +6556,25 @@
           <w:szCs w:val="28"/>
           <w:lang w:val="es-419"/>
         </w:rPr>
-        <w:t xml:space="preserve">Torres-Salazar, M., Rivas-Torres, A., &amp; Martínez-Aguilar, E. (2016). Talento verde y cadenas de suministro verdes: ¿existe una relación significativa? Revista Nova Scientia, 8(1), 421 454. </w:t>
+        <w:t xml:space="preserve">Torres-Salazar, M., Rivas-Torres, A., &amp; Martínez-Aguilar, E. (2016). Talento verde y cadenas de suministro verdes: ¿existe una relación significativa? Revista Nova </w:t>
+      </w:r>
+      <w:proofErr w:type="spellStart"/>
+      <w:r>
+        <w:rPr>
+          <w:rFonts w:ascii="Calibri" w:hAnsi="Calibri" w:cs="Calibri"/>
+          <w:szCs w:val="28"/>
+          <w:lang w:val="es-419"/>
+        </w:rPr>
+        <w:t>Scientia</w:t>
+      </w:r>
+      <w:proofErr w:type="spellEnd"/>
+      <w:r>
+        <w:rPr>
+          <w:rFonts w:ascii="Calibri" w:hAnsi="Calibri" w:cs="Calibri"/>
+          <w:szCs w:val="28"/>
+          <w:lang w:val="es-419"/>
+        </w:rPr>
+        <w:t xml:space="preserve">, 8(1), 421 454. </w:t>
       </w:r>
       <w:hyperlink r:id="rId25" w:history="1">
         <w:r>
@@ -6537,12 +6671,12 @@
       <w:pPr>
         <w:pStyle w:val="Titulosgenerales"/>
       </w:pPr>
-      <w:bookmarkStart w:id="38" w:name="_Toc213665842"/>
+      <w:bookmarkStart w:id="40" w:name="_Toc214872454"/>
       <w:r>
         <w:lastRenderedPageBreak/>
         <w:t>Créditos</w:t>
       </w:r>
-      <w:bookmarkEnd w:id="38"/>
+      <w:bookmarkEnd w:id="40"/>
     </w:p>
     <w:tbl>
       <w:tblPr>
@@ -7425,7 +7559,7 @@
                 <w:rFonts w:cs="Calibri"/>
                 <w:szCs w:val="24"/>
               </w:rPr>
-              <w:t>Jonathan Adie Villafañe</w:t>
+              <w:t>Jairo Luis Valencia Ebratt</w:t>
             </w:r>
           </w:p>
         </w:tc>
@@ -7490,7 +7624,7 @@
                 <w:rFonts w:cs="Calibri"/>
                 <w:szCs w:val="24"/>
               </w:rPr>
-              <w:t>Jairo Luis Valencia Ebratt</w:t>
+              <w:t>Jonathan Adie Villafañe</w:t>
             </w:r>
           </w:p>
         </w:tc>
@@ -14241,7 +14375,7 @@
     <w:autoRedefine/>
     <w:uiPriority w:val="39"/>
     <w:unhideWhenUsed/>
-    <w:rsid w:val="00231879"/>
+    <w:rsid w:val="009D12D5"/>
     <w:pPr>
       <w:tabs>
         <w:tab w:val="left" w:pos="567"/>
@@ -14770,10 +14904,6 @@
 </file>
 
 <file path=customXml/item1.xml><?xml version="1.0" encoding="utf-8"?>
-<b:Sources xmlns:b="http://schemas.openxmlformats.org/officeDocument/2006/bibliography" xmlns="http://schemas.openxmlformats.org/officeDocument/2006/bibliography" SelectedStyle="\APASixthEditionOfficeOnline.xsl" StyleName="APA" Version="6"/>
-</file>
-
-<file path=customXml/item2.xml><?xml version="1.0" encoding="utf-8"?>
 <p:properties xmlns:p="http://schemas.microsoft.com/office/2006/metadata/properties" xmlns:xsi="http://www.w3.org/2001/XMLSchema-instance" xmlns:pc="http://schemas.microsoft.com/office/infopath/2007/PartnerControls">
   <documentManagement>
     <TaxCatchAll xmlns="adccf511-daff-4bcb-9072-914cedbf4c7e" xsi:nil="true"/>
@@ -14784,9 +14914,22 @@
 </p:properties>
 </file>
 
+<file path=customXml/item2.xml><?xml version="1.0" encoding="utf-8"?>
+<b:Sources xmlns:b="http://schemas.openxmlformats.org/officeDocument/2006/bibliography" xmlns="http://schemas.openxmlformats.org/officeDocument/2006/bibliography" SelectedStyle="\APASixthEditionOfficeOnline.xsl" StyleName="APA" Version="6"/>
+</file>
+
 <file path=customXml/item3.xml><?xml version="1.0" encoding="utf-8"?>
-<ct:contentTypeSchema xmlns:ct="http://schemas.microsoft.com/office/2006/metadata/contentType" xmlns:ma="http://schemas.microsoft.com/office/2006/metadata/properties/metaAttributes" ct:_="" ma:_="" ma:contentTypeName="Documento" ma:contentTypeID="0x010100FC2B1768DD5A774EB396CCAB0DE361C1" ma:contentTypeVersion="12" ma:contentTypeDescription="Crear nuevo documento." ma:contentTypeScope="" ma:versionID="d4a546b22d2924edabf51241cf3422b8">
-  <xsd:schema xmlns:xsd="http://www.w3.org/2001/XMLSchema" xmlns:xs="http://www.w3.org/2001/XMLSchema" xmlns:p="http://schemas.microsoft.com/office/2006/metadata/properties" xmlns:ns2="a70d3c18-0869-45a1-9f75-4b4b8f0f32be" xmlns:ns3="adccf511-daff-4bcb-9072-914cedbf4c7e" targetNamespace="http://schemas.microsoft.com/office/2006/metadata/properties" ma:root="true" ma:fieldsID="e29002b2d9ca820e89c57fc59ec70c79" ns2:_="" ns3:_="">
+<?mso-contentType ?>
+<FormTemplates xmlns="http://schemas.microsoft.com/sharepoint/v3/contenttype/forms">
+  <Display>DocumentLibraryForm</Display>
+  <Edit>DocumentLibraryForm</Edit>
+  <New>DocumentLibraryForm</New>
+</FormTemplates>
+</file>
+
+<file path=customXml/item4.xml><?xml version="1.0" encoding="utf-8"?>
+<ct:contentTypeSchema xmlns:ct="http://schemas.microsoft.com/office/2006/metadata/contentType" xmlns:ma="http://schemas.microsoft.com/office/2006/metadata/properties/metaAttributes" ct:_="" ma:_="" ma:contentTypeName="Documento" ma:contentTypeID="0x010100FC2B1768DD5A774EB396CCAB0DE361C1" ma:contentTypeVersion="12" ma:contentTypeDescription="Crear nuevo documento." ma:contentTypeScope="" ma:versionID="cb0e967054766e77e9abf3380aaec2f9">
+  <xsd:schema xmlns:xsd="http://www.w3.org/2001/XMLSchema" xmlns:xs="http://www.w3.org/2001/XMLSchema" xmlns:p="http://schemas.microsoft.com/office/2006/metadata/properties" xmlns:ns2="a70d3c18-0869-45a1-9f75-4b4b8f0f32be" xmlns:ns3="adccf511-daff-4bcb-9072-914cedbf4c7e" targetNamespace="http://schemas.microsoft.com/office/2006/metadata/properties" ma:root="true" ma:fieldsID="e7d77fbbcf22647d83eeb28c82daf0af" ns2:_="" ns3:_="">
     <xsd:import namespace="a70d3c18-0869-45a1-9f75-4b4b8f0f32be"/>
     <xsd:import namespace="adccf511-daff-4bcb-9072-914cedbf4c7e"/>
     <xsd:element name="properties">
@@ -14985,24 +15128,7 @@
 </ct:contentTypeSchema>
 </file>
 
-<file path=customXml/item4.xml><?xml version="1.0" encoding="utf-8"?>
-<?mso-contentType ?>
-<FormTemplates xmlns="http://schemas.microsoft.com/sharepoint/v3/contenttype/forms">
-  <Display>DocumentLibraryForm</Display>
-  <Edit>DocumentLibraryForm</Edit>
-  <New>DocumentLibraryForm</New>
-</FormTemplates>
-</file>
-
 <file path=customXml/itemProps1.xml><?xml version="1.0" encoding="utf-8"?>
-<ds:datastoreItem xmlns:ds="http://schemas.openxmlformats.org/officeDocument/2006/customXml" ds:itemID="{E8AB44A3-7C62-4BD2-82ED-8ABC209970FA}">
-  <ds:schemaRefs>
-    <ds:schemaRef ds:uri="http://schemas.openxmlformats.org/officeDocument/2006/bibliography"/>
-  </ds:schemaRefs>
-</ds:datastoreItem>
-</file>
-
-<file path=customXml/itemProps2.xml><?xml version="1.0" encoding="utf-8"?>
 <ds:datastoreItem xmlns:ds="http://schemas.openxmlformats.org/officeDocument/2006/customXml" ds:itemID="{6929C9FE-9F22-4B98-96EF-1B541B3BD0B2}">
   <ds:schemaRefs>
     <ds:schemaRef ds:uri="http://schemas.microsoft.com/office/2006/metadata/properties"/>
@@ -15013,14 +15139,22 @@
 </ds:datastoreItem>
 </file>
 
-<file path=customXml/itemProps3.xml><?xml version="1.0" encoding="utf-8"?>
-<ds:datastoreItem xmlns:ds="http://schemas.openxmlformats.org/officeDocument/2006/customXml" ds:itemID="{C3406EB7-1362-4FA3-8257-BEB2BDA35A51}"/>
+<file path=customXml/itemProps2.xml><?xml version="1.0" encoding="utf-8"?>
+<ds:datastoreItem xmlns:ds="http://schemas.openxmlformats.org/officeDocument/2006/customXml" ds:itemID="{E8AB44A3-7C62-4BD2-82ED-8ABC209970FA}">
+  <ds:schemaRefs>
+    <ds:schemaRef ds:uri="http://schemas.openxmlformats.org/officeDocument/2006/bibliography"/>
+  </ds:schemaRefs>
+</ds:datastoreItem>
 </file>
 
-<file path=customXml/itemProps4.xml><?xml version="1.0" encoding="utf-8"?>
+<file path=customXml/itemProps3.xml><?xml version="1.0" encoding="utf-8"?>
 <ds:datastoreItem xmlns:ds="http://schemas.openxmlformats.org/officeDocument/2006/customXml" ds:itemID="{81CBDEC1-3B00-44ED-AD36-0268077980BA}">
   <ds:schemaRefs>
     <ds:schemaRef ds:uri="http://schemas.microsoft.com/sharepoint/v3/contenttype/forms"/>
   </ds:schemaRefs>
 </ds:datastoreItem>
+</file>
+
+<file path=customXml/itemProps4.xml><?xml version="1.0" encoding="utf-8"?>
+<ds:datastoreItem xmlns:ds="http://schemas.openxmlformats.org/officeDocument/2006/customXml" ds:itemID="{DE658A6F-B38A-45C6-A0BC-39B9953924EE}"/>
 </file>
</xml_diff>